<commit_message>
kasus siakadwhile part 2
</commit_message>
<xml_diff>
--- a/jobsheet 7 Ahmad Maynanda.docx
+++ b/jobsheet 7 Ahmad Maynanda.docx
@@ -177,7 +177,21 @@
         <w:rPr>
           <w:lang w:val="en-ID"/>
         </w:rPr>
-        <w:t>input pertama yang valid (</w:t>
+        <w:t xml:space="preserve">input </w:t>
+      </w:r>
+      <w:proofErr w:type="spellStart"/>
+      <w:r>
+        <w:rPr>
+          <w:lang w:val="en-ID"/>
+        </w:rPr>
+        <w:t>pertama</w:t>
+      </w:r>
+      <w:proofErr w:type="spellEnd"/>
+      <w:r>
+        <w:rPr>
+          <w:lang w:val="en-ID"/>
+        </w:rPr>
+        <w:t xml:space="preserve"> yang valid (</w:t>
       </w:r>
       <m:oMath>
         <m:r>
@@ -277,6 +291,7 @@
           </wp:anchor>
         </w:drawing>
       </w:r>
+      <w:proofErr w:type="spellStart"/>
       <w:r>
         <w:rPr>
           <w:rFonts w:eastAsia="Times New Roman" w:cs="Arial"/>
@@ -284,8 +299,9 @@
           <w:lang w:val="en-ID" w:eastAsia="en-ID"/>
           <w14:ligatures w14:val="none"/>
         </w:rPr>
-        <w:t>terendah = 100</w:t>
-      </w:r>
+        <w:t>terendah</w:t>
+      </w:r>
+      <w:proofErr w:type="spellEnd"/>
       <w:r>
         <w:rPr>
           <w:rFonts w:eastAsia="Times New Roman" w:cs="Arial"/>
@@ -293,7 +309,7 @@
           <w:lang w:val="en-ID" w:eastAsia="en-ID"/>
           <w14:ligatures w14:val="none"/>
         </w:rPr>
-        <w:t xml:space="preserve"> a</w:t>
+        <w:t xml:space="preserve"> = 100</w:t>
       </w:r>
       <w:r>
         <w:rPr>
@@ -302,7 +318,56 @@
           <w:lang w:val="en-ID" w:eastAsia="en-ID"/>
           <w14:ligatures w14:val="none"/>
         </w:rPr>
-        <w:t>gar nilai input pertama yang valid (</w:t>
+        <w:t xml:space="preserve"> a</w:t>
+      </w:r>
+      <w:r>
+        <w:rPr>
+          <w:rFonts w:eastAsia="Times New Roman" w:cs="Arial"/>
+          <w:kern w:val="0"/>
+          <w:lang w:val="en-ID" w:eastAsia="en-ID"/>
+          <w14:ligatures w14:val="none"/>
+        </w:rPr>
+        <w:t xml:space="preserve">gar </w:t>
+      </w:r>
+      <w:proofErr w:type="spellStart"/>
+      <w:r>
+        <w:rPr>
+          <w:rFonts w:eastAsia="Times New Roman" w:cs="Arial"/>
+          <w:kern w:val="0"/>
+          <w:lang w:val="en-ID" w:eastAsia="en-ID"/>
+          <w14:ligatures w14:val="none"/>
+        </w:rPr>
+        <w:t>nilai</w:t>
+      </w:r>
+      <w:proofErr w:type="spellEnd"/>
+      <w:r>
+        <w:rPr>
+          <w:rFonts w:eastAsia="Times New Roman" w:cs="Arial"/>
+          <w:kern w:val="0"/>
+          <w:lang w:val="en-ID" w:eastAsia="en-ID"/>
+          <w14:ligatures w14:val="none"/>
+        </w:rPr>
+        <w:t xml:space="preserve"> input </w:t>
+      </w:r>
+      <w:proofErr w:type="spellStart"/>
+      <w:r>
+        <w:rPr>
+          <w:rFonts w:eastAsia="Times New Roman" w:cs="Arial"/>
+          <w:kern w:val="0"/>
+          <w:lang w:val="en-ID" w:eastAsia="en-ID"/>
+          <w14:ligatures w14:val="none"/>
+        </w:rPr>
+        <w:t>pertama</w:t>
+      </w:r>
+      <w:proofErr w:type="spellEnd"/>
+      <w:r>
+        <w:rPr>
+          <w:rFonts w:eastAsia="Times New Roman" w:cs="Arial"/>
+          <w:kern w:val="0"/>
+          <w:lang w:val="en-ID" w:eastAsia="en-ID"/>
+          <w14:ligatures w14:val="none"/>
+        </w:rPr>
+        <w:t xml:space="preserve"> yang valid (</w:t>
       </w:r>
       <m:oMath>
         <m:r>
@@ -322,7 +387,87 @@
           <w:lang w:val="en-ID" w:eastAsia="en-ID"/>
           <w14:ligatures w14:val="none"/>
         </w:rPr>
-        <w:t>) langsung menggantikannya sebagai nilai terendah sementara.</w:t>
+        <w:t xml:space="preserve">) langsung menggantikannya </w:t>
+      </w:r>
+      <w:proofErr w:type="spellStart"/>
+      <w:r>
+        <w:rPr>
+          <w:rFonts w:eastAsia="Times New Roman" w:cs="Arial"/>
+          <w:kern w:val="0"/>
+          <w:lang w:val="en-ID" w:eastAsia="en-ID"/>
+          <w14:ligatures w14:val="none"/>
+        </w:rPr>
+        <w:t>sebagai</w:t>
+      </w:r>
+      <w:proofErr w:type="spellEnd"/>
+      <w:r>
+        <w:rPr>
+          <w:rFonts w:eastAsia="Times New Roman" w:cs="Arial"/>
+          <w:kern w:val="0"/>
+          <w:lang w:val="en-ID" w:eastAsia="en-ID"/>
+          <w14:ligatures w14:val="none"/>
+        </w:rPr>
+        <w:t xml:space="preserve"> </w:t>
+      </w:r>
+      <w:proofErr w:type="spellStart"/>
+      <w:r>
+        <w:rPr>
+          <w:rFonts w:eastAsia="Times New Roman" w:cs="Arial"/>
+          <w:kern w:val="0"/>
+          <w:lang w:val="en-ID" w:eastAsia="en-ID"/>
+          <w14:ligatures w14:val="none"/>
+        </w:rPr>
+        <w:t>nilai</w:t>
+      </w:r>
+      <w:proofErr w:type="spellEnd"/>
+      <w:r>
+        <w:rPr>
+          <w:rFonts w:eastAsia="Times New Roman" w:cs="Arial"/>
+          <w:kern w:val="0"/>
+          <w:lang w:val="en-ID" w:eastAsia="en-ID"/>
+          <w14:ligatures w14:val="none"/>
+        </w:rPr>
+        <w:t xml:space="preserve"> </w:t>
+      </w:r>
+      <w:proofErr w:type="spellStart"/>
+      <w:r>
+        <w:rPr>
+          <w:rFonts w:eastAsia="Times New Roman" w:cs="Arial"/>
+          <w:kern w:val="0"/>
+          <w:lang w:val="en-ID" w:eastAsia="en-ID"/>
+          <w14:ligatures w14:val="none"/>
+        </w:rPr>
+        <w:t>terendah</w:t>
+      </w:r>
+      <w:proofErr w:type="spellEnd"/>
+      <w:r>
+        <w:rPr>
+          <w:rFonts w:eastAsia="Times New Roman" w:cs="Arial"/>
+          <w:kern w:val="0"/>
+          <w:lang w:val="en-ID" w:eastAsia="en-ID"/>
+          <w14:ligatures w14:val="none"/>
+        </w:rPr>
+        <w:t xml:space="preserve"> </w:t>
+      </w:r>
+      <w:proofErr w:type="spellStart"/>
+      <w:r>
+        <w:rPr>
+          <w:rFonts w:eastAsia="Times New Roman" w:cs="Arial"/>
+          <w:kern w:val="0"/>
+          <w:lang w:val="en-ID" w:eastAsia="en-ID"/>
+          <w14:ligatures w14:val="none"/>
+        </w:rPr>
+        <w:t>sementara</w:t>
+      </w:r>
+      <w:proofErr w:type="spellEnd"/>
+      <w:r>
+        <w:rPr>
+          <w:rFonts w:eastAsia="Times New Roman" w:cs="Arial"/>
+          <w:kern w:val="0"/>
+          <w:lang w:val="en-ID" w:eastAsia="en-ID"/>
+          <w14:ligatures w14:val="none"/>
+        </w:rPr>
+        <w:t>.</w:t>
       </w:r>
     </w:p>
     <w:p>
@@ -528,34 +673,352 @@
       </w:pPr>
       <w:r>
         <w:rPr>
+          <w:noProof/>
+        </w:rPr>
+        <w:lastRenderedPageBreak/>
+        <w:drawing>
+          <wp:anchor distT="0" distB="0" distL="114300" distR="114300" simplePos="0" relativeHeight="251659264" behindDoc="0" locked="0" layoutInCell="1" allowOverlap="1" wp14:anchorId="0C50363A" wp14:editId="50AFAD32">
+            <wp:simplePos x="0" y="0"/>
+            <wp:positionH relativeFrom="margin">
+              <wp:align>left</wp:align>
+            </wp:positionH>
+            <wp:positionV relativeFrom="paragraph">
+              <wp:posOffset>215900</wp:posOffset>
+            </wp:positionV>
+            <wp:extent cx="4391025" cy="4721225"/>
+            <wp:effectExtent l="0" t="0" r="9525" b="3175"/>
+            <wp:wrapTopAndBottom/>
+            <wp:docPr id="1570788068" name="Picture 4"/>
+            <wp:cNvGraphicFramePr>
+              <a:graphicFrameLocks xmlns:a="http://schemas.openxmlformats.org/drawingml/2006/main" noChangeAspect="1"/>
+            </wp:cNvGraphicFramePr>
+            <a:graphic xmlns:a="http://schemas.openxmlformats.org/drawingml/2006/main">
+              <a:graphicData uri="http://schemas.openxmlformats.org/drawingml/2006/picture">
+                <pic:pic xmlns:pic="http://schemas.openxmlformats.org/drawingml/2006/picture">
+                  <pic:nvPicPr>
+                    <pic:cNvPr id="0" name="Picture 7"/>
+                    <pic:cNvPicPr>
+                      <a:picLocks noChangeAspect="1" noChangeArrowheads="1"/>
+                    </pic:cNvPicPr>
+                  </pic:nvPicPr>
+                  <pic:blipFill>
+                    <a:blip r:embed="rId11">
+                      <a:extLst>
+                        <a:ext uri="{28A0092B-C50C-407E-A947-70E740481C1C}">
+                          <a14:useLocalDpi xmlns:a14="http://schemas.microsoft.com/office/drawing/2010/main" val="0"/>
+                        </a:ext>
+                      </a:extLst>
+                    </a:blip>
+                    <a:srcRect/>
+                    <a:stretch>
+                      <a:fillRect/>
+                    </a:stretch>
+                  </pic:blipFill>
+                  <pic:spPr bwMode="auto">
+                    <a:xfrm>
+                      <a:off x="0" y="0"/>
+                      <a:ext cx="4391025" cy="4721225"/>
+                    </a:xfrm>
+                    <a:prstGeom prst="rect">
+                      <a:avLst/>
+                    </a:prstGeom>
+                    <a:noFill/>
+                    <a:ln>
+                      <a:noFill/>
+                    </a:ln>
+                  </pic:spPr>
+                </pic:pic>
+              </a:graphicData>
+            </a:graphic>
+            <wp14:sizeRelH relativeFrom="page">
+              <wp14:pctWidth>0</wp14:pctWidth>
+            </wp14:sizeRelH>
+            <wp14:sizeRelV relativeFrom="page">
+              <wp14:pctHeight>0</wp14:pctHeight>
+            </wp14:sizeRelV>
+          </wp:anchor>
+        </w:drawing>
+      </w:r>
+      <w:r>
+        <w:rPr>
           <w:b/>
           <w:bCs/>
           <w:sz w:val="24"/>
           <w:szCs w:val="24"/>
         </w:rPr>
+        <w:t>Percobaan 2</w:t>
+      </w:r>
+    </w:p>
+    <w:p>
+      <w:pPr>
+        <w:spacing w:after="0" w:line="276" w:lineRule="auto"/>
+      </w:pPr>
+    </w:p>
+    <w:p>
+      <w:pPr>
+        <w:pStyle w:val="ListParagraph"/>
+        <w:numPr>
+          <w:ilvl w:val="0"/>
+          <w:numId w:val="6"/>
+        </w:numPr>
+        <w:spacing w:after="0" w:line="276" w:lineRule="auto"/>
+      </w:pPr>
+      <w:r>
+        <w:t>Pada potongan kode berikut, tentukan maksud dan kegunaan dari sintaks berikut:</w:t>
+      </w:r>
+    </w:p>
+    <w:p>
+      <w:pPr>
+        <w:pStyle w:val="ListParagraph"/>
+        <w:numPr>
+          <w:ilvl w:val="0"/>
+          <w:numId w:val="7"/>
+        </w:numPr>
+        <w:spacing w:after="0" w:line="276" w:lineRule="auto"/>
+      </w:pPr>
+      <w:r>
+        <w:rPr>
+          <w:noProof/>
+        </w:rPr>
+        <w:drawing>
+          <wp:anchor distT="0" distB="0" distL="114300" distR="114300" simplePos="0" relativeHeight="251660288" behindDoc="0" locked="0" layoutInCell="1" allowOverlap="1" wp14:anchorId="4B81596B" wp14:editId="006AA1A7">
+            <wp:simplePos x="0" y="0"/>
+            <wp:positionH relativeFrom="column">
+              <wp:posOffset>457200</wp:posOffset>
+            </wp:positionH>
+            <wp:positionV relativeFrom="paragraph">
+              <wp:posOffset>-1270</wp:posOffset>
+            </wp:positionV>
+            <wp:extent cx="4457700" cy="612020"/>
+            <wp:effectExtent l="0" t="0" r="0" b="0"/>
+            <wp:wrapTopAndBottom/>
+            <wp:docPr id="854565379" name="Picture 6"/>
+            <wp:cNvGraphicFramePr>
+              <a:graphicFrameLocks xmlns:a="http://schemas.openxmlformats.org/drawingml/2006/main" noChangeAspect="1"/>
+            </wp:cNvGraphicFramePr>
+            <a:graphic xmlns:a="http://schemas.openxmlformats.org/drawingml/2006/main">
+              <a:graphicData uri="http://schemas.openxmlformats.org/drawingml/2006/picture">
+                <pic:pic xmlns:pic="http://schemas.openxmlformats.org/drawingml/2006/picture">
+                  <pic:nvPicPr>
+                    <pic:cNvPr id="0" name="Picture 14"/>
+                    <pic:cNvPicPr>
+                      <a:picLocks noChangeAspect="1" noChangeArrowheads="1"/>
+                    </pic:cNvPicPr>
+                  </pic:nvPicPr>
+                  <pic:blipFill>
+                    <a:blip r:embed="rId12">
+                      <a:extLst>
+                        <a:ext uri="{28A0092B-C50C-407E-A947-70E740481C1C}">
+                          <a14:useLocalDpi xmlns:a14="http://schemas.microsoft.com/office/drawing/2010/main" val="0"/>
+                        </a:ext>
+                      </a:extLst>
+                    </a:blip>
+                    <a:srcRect/>
+                    <a:stretch>
+                      <a:fillRect/>
+                    </a:stretch>
+                  </pic:blipFill>
+                  <pic:spPr bwMode="auto">
+                    <a:xfrm>
+                      <a:off x="0" y="0"/>
+                      <a:ext cx="4457700" cy="612020"/>
+                    </a:xfrm>
+                    <a:prstGeom prst="rect">
+                      <a:avLst/>
+                    </a:prstGeom>
+                    <a:noFill/>
+                    <a:ln>
+                      <a:noFill/>
+                    </a:ln>
+                  </pic:spPr>
+                </pic:pic>
+              </a:graphicData>
+            </a:graphic>
+            <wp14:sizeRelH relativeFrom="page">
+              <wp14:pctWidth>0</wp14:pctWidth>
+            </wp14:sizeRelH>
+            <wp14:sizeRelV relativeFrom="page">
+              <wp14:pctHeight>0</wp14:pctHeight>
+            </wp14:sizeRelV>
+          </wp:anchor>
+        </w:drawing>
+      </w:r>
+      <w:r>
+        <w:t>nilai &lt; 0 || nilai &gt; 100: Berfungsi untuk memvalidasi apakah nilai yang dimasukkan berada di luar rentang yang diizinkan (negatif atau lebih dari 100).</w:t>
+      </w:r>
+    </w:p>
+    <w:p>
+      <w:pPr>
+        <w:pStyle w:val="ListParagraph"/>
+        <w:numPr>
+          <w:ilvl w:val="0"/>
+          <w:numId w:val="7"/>
+        </w:numPr>
+        <w:spacing w:after="0" w:line="276" w:lineRule="auto"/>
+      </w:pPr>
+      <w:r>
+        <w:t>continue: Berfungsi untuk menghentikan iterasi saat ini secara langsung dan melewati baris kode di bawahnya, sehingga program langsung kembali ke awal perulangan untuk meminta input ulang tanpa memproses nilai yang salah tersebut.</w:t>
+      </w:r>
+    </w:p>
+    <w:p>
+      <w:pPr>
+        <w:pStyle w:val="ListParagraph"/>
+        <w:numPr>
+          <w:ilvl w:val="0"/>
+          <w:numId w:val="6"/>
+        </w:numPr>
+        <w:spacing w:after="0" w:line="276" w:lineRule="auto"/>
+      </w:pPr>
+      <w:r>
+        <w:t>Mengapa sintaks i++ dituliskan di akhir perulangan WHILE? Apa yang terjadi jika posisinya dituliskan di awal perulangan WHILE?</w:t>
+      </w:r>
+      <w:r>
+        <w:t xml:space="preserve"> </w:t>
+      </w:r>
+    </w:p>
+    <w:p>
+      <w:pPr>
+        <w:pStyle w:val="ListParagraph"/>
+        <w:numPr>
+          <w:ilvl w:val="0"/>
+          <w:numId w:val="8"/>
+        </w:numPr>
+        <w:spacing w:after="0" w:line="276" w:lineRule="auto"/>
+      </w:pPr>
+      <w:r>
+        <w:t>Posisi i++: i++ diletakkan di akhir agar variabel penghitung hanya bertambah jika input nilai yang dimasukkan valid. Jika diletakkan di awal, ketika input tidak valid dan continue dipanggil, perintah i++ akan terlewat atau mengacurkan perhitungan indeks mahasiswa.</w:t>
+      </w:r>
+    </w:p>
+    <w:p>
+      <w:pPr>
+        <w:spacing w:after="0" w:line="276" w:lineRule="auto"/>
+        <w:ind w:left="720"/>
+      </w:pPr>
+    </w:p>
+    <w:p>
+      <w:pPr>
+        <w:pStyle w:val="ListParagraph"/>
+        <w:numPr>
+          <w:ilvl w:val="0"/>
+          <w:numId w:val="6"/>
+        </w:numPr>
+        <w:spacing w:after="0" w:line="276" w:lineRule="auto"/>
+      </w:pPr>
+      <w:r>
         <w:lastRenderedPageBreak/>
-        <w:t>Percobaan 2</w:t>
-      </w:r>
-    </w:p>
-    <w:p>
-      <w:pPr>
-        <w:spacing w:after="0" w:line="276" w:lineRule="auto"/>
-      </w:pPr>
-    </w:p>
-    <w:p>
-      <w:pPr>
-        <w:spacing w:after="0" w:line="276" w:lineRule="auto"/>
-      </w:pPr>
-    </w:p>
-    <w:p>
-      <w:pPr>
-        <w:spacing w:after="0" w:line="276" w:lineRule="auto"/>
-      </w:pPr>
-    </w:p>
-    <w:p>
-      <w:pPr>
-        <w:spacing w:after="0" w:line="276" w:lineRule="auto"/>
-      </w:pPr>
+        <w:t>Apabila jumlah mahasiswa yang dimasukkan adalah 19, berapa kali perulangan WHILE akan berjalan?</w:t>
+      </w:r>
+    </w:p>
+    <w:p>
+      <w:pPr>
+        <w:pStyle w:val="ListParagraph"/>
+        <w:numPr>
+          <w:ilvl w:val="0"/>
+          <w:numId w:val="9"/>
+        </w:numPr>
+        <w:spacing w:after="0" w:line="276" w:lineRule="auto"/>
+      </w:pPr>
+      <w:r>
+        <w:t>Jumlah iterasi: Jika jumlah mahasiswa yang dimasukkan adalah 19, perulangan while akan berjalan minimal sebanyak 19 kali untuk data valid, dan bisa bertambah jika ada input nilai yang tidak valid (karena adanya perintah continue).</w:t>
+      </w:r>
+    </w:p>
+    <w:p>
+      <w:pPr>
+        <w:pStyle w:val="ListParagraph"/>
+        <w:numPr>
+          <w:ilvl w:val="0"/>
+          <w:numId w:val="6"/>
+        </w:numPr>
+        <w:spacing w:after="0" w:line="276" w:lineRule="auto"/>
+      </w:pPr>
+      <w:r>
+        <w:t>Modifikasi</w:t>
+      </w:r>
+    </w:p>
+    <w:p>
+      <w:pPr>
+        <w:pStyle w:val="ListParagraph"/>
+        <w:spacing w:after="0" w:line="276" w:lineRule="auto"/>
+      </w:pPr>
+      <w:r>
+        <w:rPr>
+          <w:noProof/>
+        </w:rPr>
+        <w:drawing>
+          <wp:inline distT="0" distB="0" distL="0" distR="0" wp14:anchorId="11D50E91" wp14:editId="72F95000">
+            <wp:extent cx="4648200" cy="638175"/>
+            <wp:effectExtent l="0" t="0" r="0" b="9525"/>
+            <wp:docPr id="1959846672" name="Picture 7"/>
+            <wp:cNvGraphicFramePr>
+              <a:graphicFrameLocks xmlns:a="http://schemas.openxmlformats.org/drawingml/2006/main" noChangeAspect="1"/>
+            </wp:cNvGraphicFramePr>
+            <a:graphic xmlns:a="http://schemas.openxmlformats.org/drawingml/2006/main">
+              <a:graphicData uri="http://schemas.openxmlformats.org/drawingml/2006/picture">
+                <pic:pic xmlns:pic="http://schemas.openxmlformats.org/drawingml/2006/picture">
+                  <pic:nvPicPr>
+                    <pic:cNvPr id="0" name="Picture 16"/>
+                    <pic:cNvPicPr>
+                      <a:picLocks noChangeAspect="1" noChangeArrowheads="1"/>
+                    </pic:cNvPicPr>
+                  </pic:nvPicPr>
+                  <pic:blipFill>
+                    <a:blip r:embed="rId12">
+                      <a:extLst>
+                        <a:ext uri="{28A0092B-C50C-407E-A947-70E740481C1C}">
+                          <a14:useLocalDpi xmlns:a14="http://schemas.microsoft.com/office/drawing/2010/main" val="0"/>
+                        </a:ext>
+                      </a:extLst>
+                    </a:blip>
+                    <a:srcRect/>
+                    <a:stretch>
+                      <a:fillRect/>
+                    </a:stretch>
+                  </pic:blipFill>
+                  <pic:spPr bwMode="auto">
+                    <a:xfrm>
+                      <a:off x="0" y="0"/>
+                      <a:ext cx="4648200" cy="638175"/>
+                    </a:xfrm>
+                    <a:prstGeom prst="rect">
+                      <a:avLst/>
+                    </a:prstGeom>
+                    <a:noFill/>
+                    <a:ln>
+                      <a:noFill/>
+                    </a:ln>
+                  </pic:spPr>
+                </pic:pic>
+              </a:graphicData>
+            </a:graphic>
+          </wp:inline>
+        </w:drawing>
+      </w:r>
+    </w:p>
+    <w:p>
+      <w:pPr>
+        <w:spacing w:after="0" w:line="276" w:lineRule="auto"/>
+      </w:pPr>
+    </w:p>
+    <w:p>
+      <w:pPr>
+        <w:spacing w:after="0" w:line="276" w:lineRule="auto"/>
+        <w:jc w:val="center"/>
+        <w:rPr>
+          <w:b/>
+          <w:bCs/>
+          <w:sz w:val="24"/>
+          <w:szCs w:val="24"/>
+        </w:rPr>
+      </w:pPr>
+      <w:r>
+        <w:rPr>
+          <w:b/>
+          <w:bCs/>
+          <w:sz w:val="24"/>
+          <w:szCs w:val="24"/>
+        </w:rPr>
+        <w:t>Percobaan 3</w:t>
+      </w:r>
     </w:p>
     <w:p>
       <w:pPr>
@@ -563,8 +1026,8 @@
       </w:pPr>
     </w:p>
     <w:sectPr>
-      <w:headerReference w:type="default" r:id="rId11"/>
-      <w:footerReference w:type="default" r:id="rId12"/>
+      <w:headerReference w:type="default" r:id="rId13"/>
+      <w:footerReference w:type="default" r:id="rId14"/>
       <w:pgSz w:w="11906" w:h="16838"/>
       <w:pgMar w:top="1440" w:right="1440" w:bottom="1440" w:left="1440" w:header="567" w:footer="708" w:gutter="0"/>
       <w:cols w:space="708"/>
@@ -815,7 +1278,7 @@
         </mc:Choice>
         <mc:Fallback>
           <w:pict>
-            <v:shapetype w14:anchorId="6F5F3C5B" id="_x0000_t32" coordsize="21600,21600" o:spt="32" o:oned="t" path="m,l21600,21600e" filled="f">
+            <v:shapetype w14:anchorId="3222AA83" id="_x0000_t32" coordsize="21600,21600" o:spt="32" o:oned="t" path="m,l21600,21600e" filled="f">
               <v:path arrowok="t" fillok="f" o:connecttype="none"/>
               <o:lock v:ext="edit" shapetype="t"/>
             </v:shapetype>
@@ -920,6 +1383,95 @@
     </w:lvl>
   </w:abstractNum>
   <w:abstractNum w:abstractNumId="1" w15:restartNumberingAfterBreak="0">
+    <w:nsid w:val="234717C8"/>
+    <w:multiLevelType w:val="hybridMultilevel"/>
+    <w:tmpl w:val="50C28064"/>
+    <w:lvl w:ilvl="0" w:tplc="3809000F">
+      <w:start w:val="1"/>
+      <w:numFmt w:val="decimal"/>
+      <w:lvlText w:val="%1."/>
+      <w:lvlJc w:val="left"/>
+      <w:pPr>
+        <w:ind w:left="720" w:hanging="360"/>
+      </w:pPr>
+      <w:rPr>
+        <w:rFonts w:hint="default"/>
+      </w:rPr>
+    </w:lvl>
+    <w:lvl w:ilvl="1" w:tplc="38090019" w:tentative="1">
+      <w:start w:val="1"/>
+      <w:numFmt w:val="lowerLetter"/>
+      <w:lvlText w:val="%2."/>
+      <w:lvlJc w:val="left"/>
+      <w:pPr>
+        <w:ind w:left="1440" w:hanging="360"/>
+      </w:pPr>
+    </w:lvl>
+    <w:lvl w:ilvl="2" w:tplc="3809001B" w:tentative="1">
+      <w:start w:val="1"/>
+      <w:numFmt w:val="lowerRoman"/>
+      <w:lvlText w:val="%3."/>
+      <w:lvlJc w:val="right"/>
+      <w:pPr>
+        <w:ind w:left="2160" w:hanging="180"/>
+      </w:pPr>
+    </w:lvl>
+    <w:lvl w:ilvl="3" w:tplc="3809000F" w:tentative="1">
+      <w:start w:val="1"/>
+      <w:numFmt w:val="decimal"/>
+      <w:lvlText w:val="%4."/>
+      <w:lvlJc w:val="left"/>
+      <w:pPr>
+        <w:ind w:left="2880" w:hanging="360"/>
+      </w:pPr>
+    </w:lvl>
+    <w:lvl w:ilvl="4" w:tplc="38090019" w:tentative="1">
+      <w:start w:val="1"/>
+      <w:numFmt w:val="lowerLetter"/>
+      <w:lvlText w:val="%5."/>
+      <w:lvlJc w:val="left"/>
+      <w:pPr>
+        <w:ind w:left="3600" w:hanging="360"/>
+      </w:pPr>
+    </w:lvl>
+    <w:lvl w:ilvl="5" w:tplc="3809001B" w:tentative="1">
+      <w:start w:val="1"/>
+      <w:numFmt w:val="lowerRoman"/>
+      <w:lvlText w:val="%6."/>
+      <w:lvlJc w:val="right"/>
+      <w:pPr>
+        <w:ind w:left="4320" w:hanging="180"/>
+      </w:pPr>
+    </w:lvl>
+    <w:lvl w:ilvl="6" w:tplc="3809000F" w:tentative="1">
+      <w:start w:val="1"/>
+      <w:numFmt w:val="decimal"/>
+      <w:lvlText w:val="%7."/>
+      <w:lvlJc w:val="left"/>
+      <w:pPr>
+        <w:ind w:left="5040" w:hanging="360"/>
+      </w:pPr>
+    </w:lvl>
+    <w:lvl w:ilvl="7" w:tplc="38090019" w:tentative="1">
+      <w:start w:val="1"/>
+      <w:numFmt w:val="lowerLetter"/>
+      <w:lvlText w:val="%8."/>
+      <w:lvlJc w:val="left"/>
+      <w:pPr>
+        <w:ind w:left="5760" w:hanging="360"/>
+      </w:pPr>
+    </w:lvl>
+    <w:lvl w:ilvl="8" w:tplc="3809001B" w:tentative="1">
+      <w:start w:val="1"/>
+      <w:numFmt w:val="lowerRoman"/>
+      <w:lvlText w:val="%9."/>
+      <w:lvlJc w:val="right"/>
+      <w:pPr>
+        <w:ind w:left="6480" w:hanging="180"/>
+      </w:pPr>
+    </w:lvl>
+  </w:abstractNum>
+  <w:abstractNum w:abstractNumId="2" w15:restartNumberingAfterBreak="0">
     <w:nsid w:val="309920FE"/>
     <w:multiLevelType w:val="hybridMultilevel"/>
     <w:tmpl w:val="21F29FC4"/>
@@ -1008,7 +1560,274 @@
       </w:pPr>
     </w:lvl>
   </w:abstractNum>
-  <w:abstractNum w:abstractNumId="2" w15:restartNumberingAfterBreak="0">
+  <w:abstractNum w:abstractNumId="3" w15:restartNumberingAfterBreak="0">
+    <w:nsid w:val="3CCA5A82"/>
+    <w:multiLevelType w:val="hybridMultilevel"/>
+    <w:tmpl w:val="8CA07924"/>
+    <w:lvl w:ilvl="0" w:tplc="75C8DB38">
+      <w:start w:val="1"/>
+      <w:numFmt w:val="lowerLetter"/>
+      <w:lvlText w:val="%1."/>
+      <w:lvlJc w:val="left"/>
+      <w:pPr>
+        <w:ind w:left="1080" w:hanging="360"/>
+      </w:pPr>
+      <w:rPr>
+        <w:rFonts w:hint="default"/>
+      </w:rPr>
+    </w:lvl>
+    <w:lvl w:ilvl="1" w:tplc="38090019" w:tentative="1">
+      <w:start w:val="1"/>
+      <w:numFmt w:val="lowerLetter"/>
+      <w:lvlText w:val="%2."/>
+      <w:lvlJc w:val="left"/>
+      <w:pPr>
+        <w:ind w:left="1800" w:hanging="360"/>
+      </w:pPr>
+    </w:lvl>
+    <w:lvl w:ilvl="2" w:tplc="3809001B" w:tentative="1">
+      <w:start w:val="1"/>
+      <w:numFmt w:val="lowerRoman"/>
+      <w:lvlText w:val="%3."/>
+      <w:lvlJc w:val="right"/>
+      <w:pPr>
+        <w:ind w:left="2520" w:hanging="180"/>
+      </w:pPr>
+    </w:lvl>
+    <w:lvl w:ilvl="3" w:tplc="3809000F" w:tentative="1">
+      <w:start w:val="1"/>
+      <w:numFmt w:val="decimal"/>
+      <w:lvlText w:val="%4."/>
+      <w:lvlJc w:val="left"/>
+      <w:pPr>
+        <w:ind w:left="3240" w:hanging="360"/>
+      </w:pPr>
+    </w:lvl>
+    <w:lvl w:ilvl="4" w:tplc="38090019" w:tentative="1">
+      <w:start w:val="1"/>
+      <w:numFmt w:val="lowerLetter"/>
+      <w:lvlText w:val="%5."/>
+      <w:lvlJc w:val="left"/>
+      <w:pPr>
+        <w:ind w:left="3960" w:hanging="360"/>
+      </w:pPr>
+    </w:lvl>
+    <w:lvl w:ilvl="5" w:tplc="3809001B" w:tentative="1">
+      <w:start w:val="1"/>
+      <w:numFmt w:val="lowerRoman"/>
+      <w:lvlText w:val="%6."/>
+      <w:lvlJc w:val="right"/>
+      <w:pPr>
+        <w:ind w:left="4680" w:hanging="180"/>
+      </w:pPr>
+    </w:lvl>
+    <w:lvl w:ilvl="6" w:tplc="3809000F" w:tentative="1">
+      <w:start w:val="1"/>
+      <w:numFmt w:val="decimal"/>
+      <w:lvlText w:val="%7."/>
+      <w:lvlJc w:val="left"/>
+      <w:pPr>
+        <w:ind w:left="5400" w:hanging="360"/>
+      </w:pPr>
+    </w:lvl>
+    <w:lvl w:ilvl="7" w:tplc="38090019" w:tentative="1">
+      <w:start w:val="1"/>
+      <w:numFmt w:val="lowerLetter"/>
+      <w:lvlText w:val="%8."/>
+      <w:lvlJc w:val="left"/>
+      <w:pPr>
+        <w:ind w:left="6120" w:hanging="360"/>
+      </w:pPr>
+    </w:lvl>
+    <w:lvl w:ilvl="8" w:tplc="3809001B" w:tentative="1">
+      <w:start w:val="1"/>
+      <w:numFmt w:val="lowerRoman"/>
+      <w:lvlText w:val="%9."/>
+      <w:lvlJc w:val="right"/>
+      <w:pPr>
+        <w:ind w:left="6840" w:hanging="180"/>
+      </w:pPr>
+    </w:lvl>
+  </w:abstractNum>
+  <w:abstractNum w:abstractNumId="4" w15:restartNumberingAfterBreak="0">
+    <w:nsid w:val="4A1C664A"/>
+    <w:multiLevelType w:val="hybridMultilevel"/>
+    <w:tmpl w:val="2D2070BC"/>
+    <w:lvl w:ilvl="0" w:tplc="99282934">
+      <w:start w:val="1"/>
+      <w:numFmt w:val="lowerLetter"/>
+      <w:lvlText w:val="%1."/>
+      <w:lvlJc w:val="left"/>
+      <w:pPr>
+        <w:ind w:left="1080" w:hanging="360"/>
+      </w:pPr>
+      <w:rPr>
+        <w:rFonts w:hint="default"/>
+      </w:rPr>
+    </w:lvl>
+    <w:lvl w:ilvl="1" w:tplc="38090019" w:tentative="1">
+      <w:start w:val="1"/>
+      <w:numFmt w:val="lowerLetter"/>
+      <w:lvlText w:val="%2."/>
+      <w:lvlJc w:val="left"/>
+      <w:pPr>
+        <w:ind w:left="1800" w:hanging="360"/>
+      </w:pPr>
+    </w:lvl>
+    <w:lvl w:ilvl="2" w:tplc="3809001B" w:tentative="1">
+      <w:start w:val="1"/>
+      <w:numFmt w:val="lowerRoman"/>
+      <w:lvlText w:val="%3."/>
+      <w:lvlJc w:val="right"/>
+      <w:pPr>
+        <w:ind w:left="2520" w:hanging="180"/>
+      </w:pPr>
+    </w:lvl>
+    <w:lvl w:ilvl="3" w:tplc="3809000F" w:tentative="1">
+      <w:start w:val="1"/>
+      <w:numFmt w:val="decimal"/>
+      <w:lvlText w:val="%4."/>
+      <w:lvlJc w:val="left"/>
+      <w:pPr>
+        <w:ind w:left="3240" w:hanging="360"/>
+      </w:pPr>
+    </w:lvl>
+    <w:lvl w:ilvl="4" w:tplc="38090019" w:tentative="1">
+      <w:start w:val="1"/>
+      <w:numFmt w:val="lowerLetter"/>
+      <w:lvlText w:val="%5."/>
+      <w:lvlJc w:val="left"/>
+      <w:pPr>
+        <w:ind w:left="3960" w:hanging="360"/>
+      </w:pPr>
+    </w:lvl>
+    <w:lvl w:ilvl="5" w:tplc="3809001B" w:tentative="1">
+      <w:start w:val="1"/>
+      <w:numFmt w:val="lowerRoman"/>
+      <w:lvlText w:val="%6."/>
+      <w:lvlJc w:val="right"/>
+      <w:pPr>
+        <w:ind w:left="4680" w:hanging="180"/>
+      </w:pPr>
+    </w:lvl>
+    <w:lvl w:ilvl="6" w:tplc="3809000F" w:tentative="1">
+      <w:start w:val="1"/>
+      <w:numFmt w:val="decimal"/>
+      <w:lvlText w:val="%7."/>
+      <w:lvlJc w:val="left"/>
+      <w:pPr>
+        <w:ind w:left="5400" w:hanging="360"/>
+      </w:pPr>
+    </w:lvl>
+    <w:lvl w:ilvl="7" w:tplc="38090019" w:tentative="1">
+      <w:start w:val="1"/>
+      <w:numFmt w:val="lowerLetter"/>
+      <w:lvlText w:val="%8."/>
+      <w:lvlJc w:val="left"/>
+      <w:pPr>
+        <w:ind w:left="6120" w:hanging="360"/>
+      </w:pPr>
+    </w:lvl>
+    <w:lvl w:ilvl="8" w:tplc="3809001B" w:tentative="1">
+      <w:start w:val="1"/>
+      <w:numFmt w:val="lowerRoman"/>
+      <w:lvlText w:val="%9."/>
+      <w:lvlJc w:val="right"/>
+      <w:pPr>
+        <w:ind w:left="6840" w:hanging="180"/>
+      </w:pPr>
+    </w:lvl>
+  </w:abstractNum>
+  <w:abstractNum w:abstractNumId="5" w15:restartNumberingAfterBreak="0">
+    <w:nsid w:val="55D173F0"/>
+    <w:multiLevelType w:val="hybridMultilevel"/>
+    <w:tmpl w:val="146AA4AC"/>
+    <w:lvl w:ilvl="0" w:tplc="7FC080E4">
+      <w:start w:val="1"/>
+      <w:numFmt w:val="lowerLetter"/>
+      <w:lvlText w:val="%1."/>
+      <w:lvlJc w:val="left"/>
+      <w:pPr>
+        <w:ind w:left="1080" w:hanging="360"/>
+      </w:pPr>
+      <w:rPr>
+        <w:rFonts w:hint="default"/>
+      </w:rPr>
+    </w:lvl>
+    <w:lvl w:ilvl="1" w:tplc="38090019" w:tentative="1">
+      <w:start w:val="1"/>
+      <w:numFmt w:val="lowerLetter"/>
+      <w:lvlText w:val="%2."/>
+      <w:lvlJc w:val="left"/>
+      <w:pPr>
+        <w:ind w:left="1800" w:hanging="360"/>
+      </w:pPr>
+    </w:lvl>
+    <w:lvl w:ilvl="2" w:tplc="3809001B" w:tentative="1">
+      <w:start w:val="1"/>
+      <w:numFmt w:val="lowerRoman"/>
+      <w:lvlText w:val="%3."/>
+      <w:lvlJc w:val="right"/>
+      <w:pPr>
+        <w:ind w:left="2520" w:hanging="180"/>
+      </w:pPr>
+    </w:lvl>
+    <w:lvl w:ilvl="3" w:tplc="3809000F" w:tentative="1">
+      <w:start w:val="1"/>
+      <w:numFmt w:val="decimal"/>
+      <w:lvlText w:val="%4."/>
+      <w:lvlJc w:val="left"/>
+      <w:pPr>
+        <w:ind w:left="3240" w:hanging="360"/>
+      </w:pPr>
+    </w:lvl>
+    <w:lvl w:ilvl="4" w:tplc="38090019" w:tentative="1">
+      <w:start w:val="1"/>
+      <w:numFmt w:val="lowerLetter"/>
+      <w:lvlText w:val="%5."/>
+      <w:lvlJc w:val="left"/>
+      <w:pPr>
+        <w:ind w:left="3960" w:hanging="360"/>
+      </w:pPr>
+    </w:lvl>
+    <w:lvl w:ilvl="5" w:tplc="3809001B" w:tentative="1">
+      <w:start w:val="1"/>
+      <w:numFmt w:val="lowerRoman"/>
+      <w:lvlText w:val="%6."/>
+      <w:lvlJc w:val="right"/>
+      <w:pPr>
+        <w:ind w:left="4680" w:hanging="180"/>
+      </w:pPr>
+    </w:lvl>
+    <w:lvl w:ilvl="6" w:tplc="3809000F" w:tentative="1">
+      <w:start w:val="1"/>
+      <w:numFmt w:val="decimal"/>
+      <w:lvlText w:val="%7."/>
+      <w:lvlJc w:val="left"/>
+      <w:pPr>
+        <w:ind w:left="5400" w:hanging="360"/>
+      </w:pPr>
+    </w:lvl>
+    <w:lvl w:ilvl="7" w:tplc="38090019" w:tentative="1">
+      <w:start w:val="1"/>
+      <w:numFmt w:val="lowerLetter"/>
+      <w:lvlText w:val="%8."/>
+      <w:lvlJc w:val="left"/>
+      <w:pPr>
+        <w:ind w:left="6120" w:hanging="360"/>
+      </w:pPr>
+    </w:lvl>
+    <w:lvl w:ilvl="8" w:tplc="3809001B" w:tentative="1">
+      <w:start w:val="1"/>
+      <w:numFmt w:val="lowerRoman"/>
+      <w:lvlText w:val="%9."/>
+      <w:lvlJc w:val="right"/>
+      <w:pPr>
+        <w:ind w:left="6840" w:hanging="180"/>
+      </w:pPr>
+    </w:lvl>
+  </w:abstractNum>
+  <w:abstractNum w:abstractNumId="6" w15:restartNumberingAfterBreak="0">
     <w:nsid w:val="5D6659A1"/>
     <w:multiLevelType w:val="hybridMultilevel"/>
     <w:tmpl w:val="C53C07F6"/>
@@ -1097,7 +1916,7 @@
       </w:pPr>
     </w:lvl>
   </w:abstractNum>
-  <w:abstractNum w:abstractNumId="3" w15:restartNumberingAfterBreak="0">
+  <w:abstractNum w:abstractNumId="7" w15:restartNumberingAfterBreak="0">
     <w:nsid w:val="712B6176"/>
     <w:multiLevelType w:val="hybridMultilevel"/>
     <w:tmpl w:val="54CEF996"/>
@@ -1186,7 +2005,7 @@
       </w:pPr>
     </w:lvl>
   </w:abstractNum>
-  <w:abstractNum w:abstractNumId="4" w15:restartNumberingAfterBreak="0">
+  <w:abstractNum w:abstractNumId="8" w15:restartNumberingAfterBreak="0">
     <w:nsid w:val="75730110"/>
     <w:multiLevelType w:val="hybridMultilevel"/>
     <w:tmpl w:val="550ABB62"/>
@@ -1276,19 +2095,31 @@
     </w:lvl>
   </w:abstractNum>
   <w:num w:numId="1" w16cid:durableId="1766224019">
-    <w:abstractNumId w:val="1"/>
+    <w:abstractNumId w:val="2"/>
   </w:num>
   <w:num w:numId="2" w16cid:durableId="2112780463">
-    <w:abstractNumId w:val="3"/>
+    <w:abstractNumId w:val="7"/>
   </w:num>
   <w:num w:numId="3" w16cid:durableId="1909261882">
-    <w:abstractNumId w:val="2"/>
+    <w:abstractNumId w:val="6"/>
   </w:num>
   <w:num w:numId="4" w16cid:durableId="134108450">
-    <w:abstractNumId w:val="4"/>
+    <w:abstractNumId w:val="8"/>
   </w:num>
   <w:num w:numId="5" w16cid:durableId="101730410">
     <w:abstractNumId w:val="0"/>
+  </w:num>
+  <w:num w:numId="6" w16cid:durableId="1105150971">
+    <w:abstractNumId w:val="1"/>
+  </w:num>
+  <w:num w:numId="7" w16cid:durableId="1048190058">
+    <w:abstractNumId w:val="5"/>
+  </w:num>
+  <w:num w:numId="8" w16cid:durableId="839126481">
+    <w:abstractNumId w:val="4"/>
+  </w:num>
+  <w:num w:numId="9" w16cid:durableId="697779205">
+    <w:abstractNumId w:val="3"/>
   </w:num>
 </w:numbering>
 </file>

</xml_diff>